<commit_message>
new changes and fix OpenAPI
</commit_message>
<xml_diff>
--- a/docs/Design-Document.docx
+++ b/docs/Design-Document.docx
@@ -176,55 +176,46 @@
         <w:shd w:fill="F5F5F5" w:val="clear"/>
       </w:pPr>
       <w:r>
+        <w:drawing>
+          <wp:inline xmlns:a="http://schemas.openxmlformats.org/drawingml/2006/main" xmlns:pic="http://schemas.openxmlformats.org/drawingml/2006/picture">
+            <wp:extent cx="5669280" cy="3779520"/>
+            <wp:docPr id="1" name="Picture 1"/>
+            <wp:cNvGraphicFramePr>
+              <a:graphicFrameLocks noChangeAspect="1"/>
+            </wp:cNvGraphicFramePr>
+            <a:graphic>
+              <a:graphicData uri="http://schemas.openxmlformats.org/drawingml/2006/picture">
+                <pic:pic>
+                  <pic:nvPicPr>
+                    <pic:cNvPr id="0" name="system-context-architecture.png"/>
+                    <pic:cNvPicPr/>
+                  </pic:nvPicPr>
+                  <pic:blipFill>
+                    <a:blip r:embed="rId9"/>
+                    <a:stretch>
+                      <a:fillRect/>
+                    </a:stretch>
+                  </pic:blipFill>
+                  <pic:spPr>
+                    <a:xfrm>
+                      <a:off x="0" y="0"/>
+                      <a:ext cx="5669280" cy="3779520"/>
+                    </a:xfrm>
+                    <a:prstGeom prst="rect"/>
+                  </pic:spPr>
+                </pic:pic>
+              </a:graphicData>
+            </a:graphic>
+          </wp:inline>
+        </w:drawing>
+      </w:r>
+    </w:p>
+    <w:p>
+      <w:r>
         <w:rPr>
-          <w:rFonts w:ascii="Consolas" w:hAnsi="Consolas"/>
-          <w:sz w:val="18"/>
+          <w:i/>
         </w:rPr>
-        <w:t>[mermaid] flowchart LR</w:t>
-        <w:br/>
-        <w:t xml:space="preserve">  subgraph clients [Clients]</w:t>
-        <w:br/>
-        <w:t xml:space="preserve">    Browser[Browser SPA]</w:t>
-        <w:br/>
-        <w:t xml:space="preserve">  end</w:t>
-        <w:br/>
-        <w:t xml:space="preserve">  subgraph edge [Optional edge]</w:t>
-        <w:br/>
-        <w:t xml:space="preserve">    Nginx[nginx reverse proxy]</w:t>
-        <w:br/>
-        <w:t xml:space="preserve">  end</w:t>
-        <w:br/>
-        <w:t xml:space="preserve">  subgraph backend [Spring Boot]</w:t>
-        <w:br/>
-        <w:t xml:space="preserve">    API[REST controllers]</w:t>
-        <w:br/>
-        <w:t xml:space="preserve">    SVC[Services + state machine]</w:t>
-        <w:br/>
-        <w:t xml:space="preserve">    SEC[Security filters]</w:t>
-        <w:br/>
-        <w:t xml:space="preserve">  end</w:t>
-        <w:br/>
-        <w:t xml:space="preserve">  subgraph data [Persistence]</w:t>
-        <w:br/>
-        <w:t xml:space="preserve">    DB[(MySQL)]</w:t>
-        <w:br/>
-        <w:t xml:space="preserve">    FS[Document storage root]</w:t>
-        <w:br/>
-        <w:t xml:space="preserve">  end</w:t>
-        <w:br/>
-        <w:t xml:space="preserve">  Browser --&gt; Nginx</w:t>
-        <w:br/>
-        <w:t xml:space="preserve">  Nginx --&gt; API</w:t>
-        <w:br/>
-        <w:t xml:space="preserve">  Browser --&gt; API</w:t>
-        <w:br/>
-        <w:t xml:space="preserve">  SEC --&gt; API</w:t>
-        <w:br/>
-        <w:t xml:space="preserve">  API --&gt; SVC</w:t>
-        <w:br/>
-        <w:t xml:space="preserve">  SVC --&gt; DB</w:t>
-        <w:br/>
-        <w:t xml:space="preserve">  SVC --&gt; FS</w:t>
+        <w:t>Figure — System context. REST for ordinary requests; browsers also open STOMP over WebSocket (/ws, typically proxied together with /api) for live application status updates.</w:t>
       </w:r>
     </w:p>
     <w:p>
@@ -2621,33 +2612,46 @@
         <w:shd w:fill="F5F5F5" w:val="clear"/>
       </w:pPr>
       <w:r>
+        <w:drawing>
+          <wp:inline xmlns:a="http://schemas.openxmlformats.org/drawingml/2006/main" xmlns:pic="http://schemas.openxmlformats.org/drawingml/2006/picture">
+            <wp:extent cx="5669280" cy="3779520"/>
+            <wp:docPr id="2" name="Picture 2"/>
+            <wp:cNvGraphicFramePr>
+              <a:graphicFrameLocks noChangeAspect="1"/>
+            </wp:cNvGraphicFramePr>
+            <a:graphic>
+              <a:graphicData uri="http://schemas.openxmlformats.org/drawingml/2006/picture">
+                <pic:pic>
+                  <pic:nvPicPr>
+                    <pic:cNvPr id="0" name="application-workflow-state.png"/>
+                    <pic:cNvPicPr/>
+                  </pic:nvPicPr>
+                  <pic:blipFill>
+                    <a:blip r:embed="rId10"/>
+                    <a:stretch>
+                      <a:fillRect/>
+                    </a:stretch>
+                  </pic:blipFill>
+                  <pic:spPr>
+                    <a:xfrm>
+                      <a:off x="0" y="0"/>
+                      <a:ext cx="5669280" cy="3779520"/>
+                    </a:xfrm>
+                    <a:prstGeom prst="rect"/>
+                  </pic:spPr>
+                </pic:pic>
+              </a:graphicData>
+            </a:graphic>
+          </wp:inline>
+        </w:drawing>
+      </w:r>
+    </w:p>
+    <w:p>
+      <w:r>
         <w:rPr>
-          <w:rFonts w:ascii="Consolas" w:hAnsi="Consolas"/>
-          <w:sz w:val="18"/>
+          <w:i/>
         </w:rPr>
-        <w:t>[mermaid] stateDiagram-v2</w:t>
-        <w:br/>
-        <w:t xml:space="preserve">  direction LR</w:t>
-        <w:br/>
-        <w:t xml:space="preserve">  [*] --&gt; DRAFT</w:t>
-        <w:br/>
-        <w:t xml:space="preserve">  DRAFT --&gt; SUBMITTED: APPLICANT submits</w:t>
-        <w:br/>
-        <w:t xml:space="preserve">  SUBMITTED --&gt; UNDER_REVIEW: REVIEWER begins review</w:t>
-        <w:br/>
-        <w:t xml:space="preserve">  UNDER_REVIEW --&gt; PENDING_ADDITIONAL_INFO: REVIEWER requests info</w:t>
-        <w:br/>
-        <w:t xml:space="preserve">  UNDER_REVIEW --&gt; REVIEWED: REVIEWER submits review</w:t>
-        <w:br/>
-        <w:t xml:space="preserve">  PENDING_ADDITIONAL_INFO --&gt; UNDER_REVIEW: APPLICANT resubmits</w:t>
-        <w:br/>
-        <w:t xml:space="preserve">  REVIEWED --&gt; APPROVED: APPROVER decides</w:t>
-        <w:br/>
-        <w:t xml:space="preserve">  REVIEWED --&gt; REJECTED: APPROVER decides</w:t>
-        <w:br/>
-        <w:t xml:space="preserve">  APPROVED --&gt; [*]</w:t>
-        <w:br/>
-        <w:t xml:space="preserve">  REJECTED --&gt; [*]</w:t>
+        <w:t>Figure — Application lifecycle states and transitions (roles on each edge).</w:t>
       </w:r>
     </w:p>
     <w:p>

</xml_diff>